<commit_message>
Rework dossier: inline clickable timestamps at each quote (jump to exact second)
Co-Authored-By: Claude Fable 5 <noreply@anthropic.com>
Claude-Session: https://claude.ai/code/session_01HD35skKYsV2wk8PfNqSf8a
</commit_message>
<xml_diff>
--- a/kawas_research/Aber-Kawas-Dossier-v2.docx
+++ b/kawas_research/Aber-Kawas-Dossier-v2.docx
@@ -7,7 +7,7 @@
         <w:pStyle w:val="Heading1"/>
       </w:pPr>
       <w:r>
-        <w:t>ABER KAWAS — RESEARCH DOSSIER (v2)</w:t>
+        <w:t>ABER KAWAS — RESEARCH DOSSIER</w:t>
       </w:r>
     </w:p>
     <w:p>
@@ -15,30 +15,19 @@
         <w:rPr>
           <w:b/>
         </w:rPr>
-        <w:t>Rebuilt 2026-07-11 · Live sources only (no archive links) · Video quotes carry precise timestamps.</w:t>
+        <w:t>Rebuilt 2026-07-11 · Live sources only (no archives).</w:t>
       </w:r>
-    </w:p>
-    <w:p>
       <w:r>
-        <w:t xml:space="preserve">Every citation below is a footnote number </w:t>
+        <w:t xml:space="preserve"> Every video quote has a </w:t>
       </w:r>
       <w:r>
         <w:rPr>
           <w:b/>
         </w:rPr>
-        <w:t>[n]</w:t>
+        <w:t>clickable timestamp</w:t>
       </w:r>
       <w:r>
-        <w:t xml:space="preserve"> that maps to the numbered </w:t>
-      </w:r>
-      <w:r>
-        <w:rPr>
-          <w:b/>
-        </w:rPr>
-        <w:t>Sources</w:t>
-      </w:r>
-      <w:r>
-        <w:t xml:space="preserve"> list at the end — all live articles, live videos, live court/campaign documents. Where a claim rests on a now-deleted page, that is stated plainly and the citation is the news article that reported it (with the outlet's political lean noted).</w:t>
+        <w:t xml:space="preserve"> that opens the video at that exact moment. Source links are inline.</w:t>
       </w:r>
     </w:p>
     <w:p>
@@ -81,13 +70,19 @@
         <w:t>Won the June 23, 2026 Democratic primary for NY State Senate District 12</w:t>
       </w:r>
       <w:r>
-        <w:t xml:space="preserve"> (western Queens: Astoria, Long Island City, Sunnyside, Woodside, Maspeth, Ridgewood) with ~60% over Assemblyman Steven Raga. She would be the first Palestinian-American and first Muslim woman in the NY State Legislature. </w:t>
+        <w:t xml:space="preserve"> (western Queens) with ~60% over Assemblyman Steven Raga — would be the first Palestinian-American and first Muslim woman in the NY Legislature. Source: </w:t>
       </w:r>
+      <w:hyperlink r:id="rId9">
+        <w:r>
+          <w:rPr>
+            <w:color w:val="1155CC"/>
+            <w:u w:val="single"/>
+          </w:rPr>
+          <w:t xml:space="preserve">QNS</w:t>
+        </w:r>
+      </w:hyperlink>
       <w:r>
-        <w:rPr>
-          <w:b/>
-        </w:rPr>
-        <w:t>[14]</w:t>
+        <w:t>.</w:t>
       </w:r>
     </w:p>
     <w:p>
@@ -101,13 +96,19 @@
         <w:t>Endorsed by Mayor Zohran Mamdani; longtime NYC-DSA member.</w:t>
       </w:r>
       <w:r>
-        <w:t xml:space="preserve"> </w:t>
+        <w:t xml:space="preserve"> Source: </w:t>
       </w:r>
+      <w:hyperlink r:id="rId10">
+        <w:r>
+          <w:rPr>
+            <w:color w:val="1155CC"/>
+            <w:u w:val="single"/>
+          </w:rPr>
+          <w:t xml:space="preserve">Jewish Insider</w:t>
+        </w:r>
+      </w:hyperlink>
       <w:r>
-        <w:rPr>
-          <w:b/>
-        </w:rPr>
-        <w:t>[3][14]</w:t>
+        <w:t>.</w:t>
       </w:r>
     </w:p>
     <w:p>
@@ -115,16 +116,19 @@
         <w:pStyle w:val="ListBullet"/>
       </w:pPr>
       <w:r>
-        <w:t xml:space="preserve">Her platforms: campaign site </w:t>
+        <w:t xml:space="preserve">Campaign site: </w:t>
       </w:r>
+      <w:hyperlink r:id="rId11">
+        <w:r>
+          <w:rPr>
+            <w:color w:val="1155CC"/>
+            <w:u w:val="single"/>
+          </w:rPr>
+          <w:t xml:space="preserve">aberforsenate.com</w:t>
+        </w:r>
+      </w:hyperlink>
       <w:r>
-        <w:rPr>
-          <w:b/>
-        </w:rPr>
-        <w:t>[19]</w:t>
-      </w:r>
-      <w:r>
-        <w:t>, X @AberKawas, Instagram @aberkawas.</w:t>
+        <w:t xml:space="preserve"> · X @AberKawas · Instagram @aberkawas.</w:t>
       </w:r>
     </w:p>
     <w:p>
@@ -147,117 +151,132 @@
         <w:pStyle w:val="Heading3"/>
       </w:pPr>
       <w:r>
-        <w:t>1. 2017 "Islamophobia Beyond 9/11" video — downplays 9/11 (video is live; timestamps exact)</w:t>
+        <w:t>1. 2017 "Islamophobia Beyond 9/11" — downplays 9/11</w:t>
       </w:r>
     </w:p>
     <w:p>
       <w:r>
-        <w:t xml:space="preserve">Video: Asian American Writers' Workshop, "Islamophobia Beyond 9/11 with Aber Kawas." </w:t>
+        <w:t xml:space="preserve">Video: Asian American Writers' Workshop, </w:t>
+      </w:r>
+      <w:hyperlink r:id="rId12">
+        <w:r>
+          <w:rPr>
+            <w:color w:val="1155CC"/>
+            <w:u w:val="single"/>
+          </w:rPr>
+          <w:t xml:space="preserve">"Islamophobia Beyond 9/11 with Aber Kawas"</w:t>
+        </w:r>
+      </w:hyperlink>
+      <w:r>
+        <w:t>.</w:t>
+      </w:r>
+    </w:p>
+    <w:p>
+      <w:pPr>
+        <w:ind w:left="504"/>
+      </w:pPr>
+      <w:r>
+        <w:rPr>
+          <w:i/>
+        </w:rPr>
+        <w:t xml:space="preserve">"…the system of capitalism and racism and white supremacy, etc.… and Islamophobia have all been used to colonize land… we're just seeing the manifestations of that </w:t>
       </w:r>
       <w:r>
         <w:rPr>
           <w:b/>
+          <w:i/>
         </w:rPr>
-        <w:t>[1]</w:t>
+        <w:t>continuation with 9/11</w:t>
       </w:r>
+      <w:r>
+        <w:rPr>
+          <w:i/>
+        </w:rPr>
+        <w:t xml:space="preserve">." — ▶ </w:t>
+      </w:r>
+      <w:hyperlink r:id="rId13">
+        <w:r>
+          <w:rPr>
+            <w:color w:val="1155CC"/>
+            <w:u w:val="single"/>
+          </w:rPr>
+          <w:t xml:space="preserve">watch at 1:21</w:t>
+        </w:r>
+      </w:hyperlink>
     </w:p>
     <w:p>
       <w:pPr>
-        <w:pStyle w:val="ListBullet"/>
+        <w:ind w:left="504"/>
       </w:pPr>
       <w:r>
         <w:rPr>
-          <w:b/>
+          <w:i/>
         </w:rPr>
-        <w:t>At 1:21</w:t>
-      </w:r>
-      <w:r>
-        <w:t xml:space="preserve"> — "…the system of capitalism and racism and white supremacy, etc.… and Islamophobia have all been used to colonize land… we're just seeing the manifestations of that </w:t>
+        <w:t xml:space="preserve">"…the idea that we have to apologize for </w:t>
       </w:r>
       <w:r>
         <w:rPr>
           <w:b/>
-        </w:rPr>
-        <w:t>continuation with 9/11</w:t>
-      </w:r>
-      <w:r>
-        <w:t xml:space="preserve">." </w:t>
-      </w:r>
-      <w:r>
-        <w:rPr>
-          <w:b/>
-        </w:rPr>
-        <w:t>[1]</w:t>
-      </w:r>
-    </w:p>
-    <w:p>
-      <w:pPr>
-        <w:pStyle w:val="ListBullet"/>
-      </w:pPr>
-      <w:r>
-        <w:rPr>
-          <w:b/>
-        </w:rPr>
-        <w:t>At 2:06</w:t>
-      </w:r>
-      <w:r>
-        <w:t xml:space="preserve"> — "…the idea that we have to apologize for </w:t>
-      </w:r>
-      <w:r>
-        <w:rPr>
-          <w:b/>
+          <w:i/>
         </w:rPr>
         <w:t>a terror attack that a couple people did</w:t>
       </w:r>
       <w:r>
+        <w:rPr>
+          <w:i/>
+        </w:rPr>
         <w:t xml:space="preserve">, and then there is no apologies or reparations for genocides and for slavery… is something that I kind of find </w:t>
       </w:r>
       <w:r>
         <w:rPr>
           <w:b/>
+          <w:i/>
         </w:rPr>
         <w:t>reprehensible</w:t>
       </w:r>
       <w:r>
-        <w:t xml:space="preserve">." </w:t>
+        <w:rPr>
+          <w:i/>
+        </w:rPr>
+        <w:t xml:space="preserve">." — ▶ </w:t>
       </w:r>
-      <w:r>
-        <w:rPr>
-          <w:b/>
-        </w:rPr>
-        <w:t>[1]</w:t>
-      </w:r>
+      <w:hyperlink r:id="rId14">
+        <w:r>
+          <w:rPr>
+            <w:color w:val="1155CC"/>
+            <w:u w:val="single"/>
+          </w:rPr>
+          <w:t xml:space="preserve">watch at 2:06</w:t>
+        </w:r>
+      </w:hyperlink>
     </w:p>
     <w:p>
-      <w:pPr>
-        <w:pStyle w:val="ListBullet"/>
-      </w:pPr>
       <w:r>
-        <w:t xml:space="preserve">Reported by Fox News (June 26, 2026), which also carries her defense: she called it a "cherry-picked… desperate, Islamophobic smear" and said she meant "Muslims should [not] have to apologize for an act of violence they have nothing to do with." </w:t>
+        <w:t xml:space="preserve">Coverage + her defense ("cherry-picked… desperate, Islamophobic smear"): </w:t>
       </w:r>
+      <w:hyperlink r:id="rId15">
+        <w:r>
+          <w:rPr>
+            <w:color w:val="1155CC"/>
+            <w:u w:val="single"/>
+          </w:rPr>
+          <w:t xml:space="preserve">Fox News, June 26 2026</w:t>
+        </w:r>
+      </w:hyperlink>
       <w:r>
-        <w:rPr>
-          <w:b/>
-        </w:rPr>
-        <w:t>[2]</w:t>
+        <w:t xml:space="preserve"> · </w:t>
       </w:r>
+      <w:hyperlink r:id="rId16">
+        <w:r>
+          <w:rPr>
+            <w:color w:val="1155CC"/>
+            <w:u w:val="single"/>
+          </w:rPr>
+          <w:t xml:space="preserve">Mediaite, June 24 2026</w:t>
+        </w:r>
+      </w:hyperlink>
       <w:r>
-        <w:t xml:space="preserve"> Also covered by Mediaite (June 24, 2026), which notes the clip was first shared publicly by Drew Pavlou. </w:t>
-      </w:r>
-      <w:r>
-        <w:rPr>
-          <w:b/>
-        </w:rPr>
-        <w:t>[4]</w:t>
-      </w:r>
-      <w:r>
-        <w:t xml:space="preserve"> First surfaced in mainstream press by Jewish Insider (Nov 20, 2025). </w:t>
-      </w:r>
-      <w:r>
-        <w:rPr>
-          <w:b/>
-        </w:rPr>
-        <w:t>[3]</w:t>
+        <w:t>.</w:t>
       </w:r>
     </w:p>
     <w:p>
@@ -265,23 +284,475 @@
         <w:pStyle w:val="Heading3"/>
       </w:pPr>
       <w:r>
-        <w:t>2. Father's deportation narrative vs. the court record</w:t>
+        <w:t>2. NYC-DSA rally — divest pensions from Israel, block weapons through Queens</w:t>
       </w:r>
     </w:p>
     <w:p>
       <w:r>
-        <w:t xml:space="preserve">Her narrative, on camera: her father was taken by ICE, detained ~3 years, and deported to Jordan "the year Obama was elected" (2008), which she attributes to a "cruel immigration system." </w:t>
+        <w:t xml:space="preserve">Video: </w:t>
+      </w:r>
+      <w:hyperlink r:id="rId17">
+        <w:r>
+          <w:rPr>
+            <w:color w:val="1155CC"/>
+            <w:u w:val="single"/>
+          </w:rPr>
+          <w:t xml:space="preserve">NYC-DSA slate rally</w:t>
+        </w:r>
+      </w:hyperlink>
+      <w:r>
+        <w:t xml:space="preserve"> (Linda Sarsour introduces her).</w:t>
+      </w:r>
+    </w:p>
+    <w:p>
+      <w:pPr>
+        <w:ind w:left="504"/>
+      </w:pPr>
+      <w:r>
+        <w:rPr>
+          <w:i/>
+        </w:rPr>
+        <w:t xml:space="preserve">"…that is the bill that </w:t>
       </w:r>
       <w:r>
         <w:rPr>
           <w:b/>
+          <w:i/>
         </w:rPr>
-        <w:t>[8]</w:t>
+        <w:t>I helped write</w:t>
+      </w:r>
+      <w:r>
+        <w:rPr>
+          <w:i/>
+        </w:rPr>
+        <w:t xml:space="preserve"> with then-Assembly Member Mamdani" (the "Not on Our Dime" bill). — ▶ </w:t>
+      </w:r>
+      <w:hyperlink r:id="rId18">
+        <w:r>
+          <w:rPr>
+            <w:color w:val="1155CC"/>
+            <w:u w:val="single"/>
+          </w:rPr>
+          <w:t xml:space="preserve">watch at 10:17</w:t>
+        </w:r>
+      </w:hyperlink>
+    </w:p>
+    <w:p>
+      <w:pPr>
+        <w:ind w:left="504"/>
+      </w:pPr>
+      <w:r>
+        <w:rPr>
+          <w:i/>
+        </w:rPr>
+        <w:t xml:space="preserve">"We are going to pass Not on Our Dime. We are going to </w:t>
+      </w:r>
+      <w:r>
+        <w:rPr>
+          <w:b/>
+          <w:i/>
+        </w:rPr>
+        <w:t>divest our state pension funds from Israel</w:t>
+      </w:r>
+      <w:r>
+        <w:rPr>
+          <w:i/>
+        </w:rPr>
+        <w:t xml:space="preserve">." — ▶ </w:t>
+      </w:r>
+      <w:hyperlink r:id="rId19">
+        <w:r>
+          <w:rPr>
+            <w:color w:val="1155CC"/>
+            <w:u w:val="single"/>
+          </w:rPr>
+          <w:t xml:space="preserve">watch at 10:32</w:t>
+        </w:r>
+      </w:hyperlink>
+    </w:p>
+    <w:p>
+      <w:pPr>
+        <w:ind w:left="504"/>
+      </w:pPr>
+      <w:r>
+        <w:rPr>
+          <w:i/>
+        </w:rPr>
+        <w:t xml:space="preserve">"…we are going to </w:t>
+      </w:r>
+      <w:r>
+        <w:rPr>
+          <w:b/>
+          <w:i/>
+        </w:rPr>
+        <w:t>stop the pipeline of weapons being shipped from our airports here in Queens</w:t>
+      </w:r>
+      <w:r>
+        <w:rPr>
+          <w:i/>
+        </w:rPr>
+        <w:t xml:space="preserve">." — ▶ </w:t>
+      </w:r>
+      <w:hyperlink r:id="rId20">
+        <w:r>
+          <w:rPr>
+            <w:color w:val="1155CC"/>
+            <w:u w:val="single"/>
+          </w:rPr>
+          <w:t xml:space="preserve">watch at 10:51</w:t>
+        </w:r>
+      </w:hyperlink>
+    </w:p>
+    <w:p>
+      <w:pPr>
+        <w:ind w:left="504"/>
+      </w:pPr>
+      <w:r>
+        <w:rPr>
+          <w:i/>
+        </w:rPr>
+        <w:t xml:space="preserve">Sarsour: "…I've known her since she was </w:t>
+      </w:r>
+      <w:r>
+        <w:rPr>
+          <w:b/>
+          <w:i/>
+        </w:rPr>
+        <w:t>12 years old</w:t>
+      </w:r>
+      <w:r>
+        <w:rPr>
+          <w:i/>
+        </w:rPr>
+        <w:t xml:space="preserve">." — ▶ </w:t>
+      </w:r>
+      <w:hyperlink r:id="rId21">
+        <w:r>
+          <w:rPr>
+            <w:color w:val="1155CC"/>
+            <w:u w:val="single"/>
+          </w:rPr>
+          <w:t xml:space="preserve">watch at 2:42</w:t>
+        </w:r>
+      </w:hyperlink>
+    </w:p>
+    <w:p>
+      <w:pPr>
+        <w:pStyle w:val="Heading3"/>
+      </w:pPr>
+      <w:r>
+        <w:t>3. "Not on Our Dime" co-authorship + calls NY charities funders of "atrocities"</w:t>
       </w:r>
     </w:p>
     <w:p>
       <w:r>
-        <w:t xml:space="preserve">The record: her father, Abdelkareem Kawas (Jordanian national), overstayed a 1989 tourist visa, </w:t>
+        <w:t xml:space="preserve">Video: </w:t>
+      </w:r>
+      <w:hyperlink r:id="rId22">
+        <w:r>
+          <w:rPr>
+            <w:color w:val="1155CC"/>
+            <w:u w:val="single"/>
+          </w:rPr>
+          <w:t xml:space="preserve">sit-down interview</w:t>
+        </w:r>
+      </w:hyperlink>
+      <w:r>
+        <w:t>.</w:t>
+      </w:r>
+    </w:p>
+    <w:p>
+      <w:pPr>
+        <w:ind w:left="504"/>
+      </w:pPr>
+      <w:r>
+        <w:rPr>
+          <w:i/>
+        </w:rPr>
+        <w:t xml:space="preserve">"…I'm someone who </w:t>
+      </w:r>
+      <w:r>
+        <w:rPr>
+          <w:b/>
+          <w:i/>
+        </w:rPr>
+        <w:t>helped write the Not on Our Dime</w:t>
+      </w:r>
+      <w:r>
+        <w:rPr>
+          <w:i/>
+        </w:rPr>
+        <w:t xml:space="preserve"> [bill]…" — ▶ </w:t>
+      </w:r>
+      <w:hyperlink r:id="rId23">
+        <w:r>
+          <w:rPr>
+            <w:color w:val="1155CC"/>
+            <w:u w:val="single"/>
+          </w:rPr>
+          <w:t xml:space="preserve">watch at 8:03</w:t>
+        </w:r>
+      </w:hyperlink>
+    </w:p>
+    <w:p>
+      <w:pPr>
+        <w:ind w:left="504"/>
+      </w:pPr>
+      <w:r>
+        <w:rPr>
+          <w:i/>
+        </w:rPr>
+        <w:t xml:space="preserve">The targeted charities raise money "under charitable status… </w:t>
+      </w:r>
+      <w:r>
+        <w:rPr>
+          <w:b/>
+          <w:i/>
+        </w:rPr>
+        <w:t>to literally fund people to go commit human rights atrocities abroad</w:t>
+      </w:r>
+      <w:r>
+        <w:rPr>
+          <w:i/>
+        </w:rPr>
+        <w:t xml:space="preserve">." — ▶ </w:t>
+      </w:r>
+      <w:hyperlink r:id="rId24">
+        <w:r>
+          <w:rPr>
+            <w:color w:val="1155CC"/>
+            <w:u w:val="single"/>
+          </w:rPr>
+          <w:t xml:space="preserve">watch at 8:20</w:t>
+        </w:r>
+      </w:hyperlink>
+    </w:p>
+    <w:p>
+      <w:r>
+        <w:t xml:space="preserve">Corroboration that she helped write the bill before running: </w:t>
+      </w:r>
+      <w:hyperlink r:id="rId25">
+        <w:r>
+          <w:rPr>
+            <w:color w:val="1155CC"/>
+            <w:u w:val="single"/>
+          </w:rPr>
+          <w:t xml:space="preserve">City &amp; State, May 2026</w:t>
+        </w:r>
+      </w:hyperlink>
+      <w:r>
+        <w:t>.</w:t>
+      </w:r>
+    </w:p>
+    <w:p>
+      <w:pPr>
+        <w:pStyle w:val="Heading3"/>
+      </w:pPr>
+      <w:r>
+        <w:t>4. Mahmoud Khalil / ICE-detainee advocacy (her own words)</w:t>
+      </w:r>
+    </w:p>
+    <w:p>
+      <w:r>
+        <w:t>Same interview:</w:t>
+      </w:r>
+    </w:p>
+    <w:p>
+      <w:pPr>
+        <w:ind w:left="504"/>
+      </w:pPr>
+      <w:r>
+        <w:rPr>
+          <w:i/>
+        </w:rPr>
+        <w:t xml:space="preserve">"You can see behind me I have a </w:t>
+      </w:r>
+      <w:r>
+        <w:rPr>
+          <w:b/>
+          <w:i/>
+        </w:rPr>
+        <w:t>Free Mahmoud Khalil poster</w:t>
+      </w:r>
+      <w:r>
+        <w:rPr>
+          <w:i/>
+        </w:rPr>
+        <w:t xml:space="preserve">. I was part of a legal organization, </w:t>
+      </w:r>
+      <w:r>
+        <w:rPr>
+          <w:b/>
+          <w:i/>
+        </w:rPr>
+        <w:t>CLEAR</w:t>
+      </w:r>
+      <w:r>
+        <w:rPr>
+          <w:i/>
+        </w:rPr>
+        <w:t xml:space="preserve">, which was one of his legal representatives…" — ▶ </w:t>
+      </w:r>
+      <w:hyperlink r:id="rId26">
+        <w:r>
+          <w:rPr>
+            <w:color w:val="1155CC"/>
+            <w:u w:val="single"/>
+          </w:rPr>
+          <w:t xml:space="preserve">watch at 11:34</w:t>
+        </w:r>
+      </w:hyperlink>
+    </w:p>
+    <w:p>
+      <w:r>
+        <w:t xml:space="preserve">Her CLEAR role (Associate Director of Partnerships, July 2024–April 2026) is confirmed on the </w:t>
+      </w:r>
+      <w:hyperlink r:id="rId27">
+        <w:r>
+          <w:rPr>
+            <w:color w:val="1155CC"/>
+            <w:u w:val="single"/>
+          </w:rPr>
+          <w:t xml:space="preserve">CUNY Law CLEAR staff page</w:t>
+        </w:r>
+      </w:hyperlink>
+      <w:r>
+        <w:t>.</w:t>
+      </w:r>
+    </w:p>
+    <w:p>
+      <w:pPr>
+        <w:pStyle w:val="Heading3"/>
+      </w:pPr>
+      <w:r>
+        <w:t>5. Self-identified anti-Zionist; defends al-Qaeda-support defendant</w:t>
+      </w:r>
+    </w:p>
+    <w:p>
+      <w:hyperlink r:id="rId28">
+        <w:r>
+          <w:rPr>
+            <w:color w:val="1155CC"/>
+            <w:u w:val="single"/>
+          </w:rPr>
+          <w:t xml:space="preserve">City &amp; State New York interview, Nov 24 2025</w:t>
+        </w:r>
+      </w:hyperlink>
+      <w:r>
+        <w:t>:</w:t>
+      </w:r>
+    </w:p>
+    <w:p>
+      <w:pPr>
+        <w:ind w:left="504"/>
+      </w:pPr>
+      <w:r>
+        <w:rPr>
+          <w:i/>
+        </w:rPr>
+        <w:t>"</w:t>
+      </w:r>
+      <w:r>
+        <w:rPr>
+          <w:b/>
+          <w:i/>
+        </w:rPr>
+        <w:t>I would identify as an anti-Zionist</w:t>
+      </w:r>
+      <w:r>
+        <w:rPr>
+          <w:i/>
+        </w:rPr>
+        <w:t>… somebody who wants an end to the occupation and apartheid and genocide in Palestine."</w:t>
+      </w:r>
+    </w:p>
+    <w:p>
+      <w:pPr>
+        <w:ind w:left="504"/>
+      </w:pPr>
+      <w:r>
+        <w:rPr>
+          <w:i/>
+        </w:rPr>
+        <w:t xml:space="preserve">On </w:t>
+      </w:r>
+      <w:r>
+        <w:rPr>
+          <w:b/>
+          <w:i/>
+        </w:rPr>
+        <w:t>Syed Fahad Hashmi</w:t>
+      </w:r>
+      <w:r>
+        <w:rPr>
+          <w:i/>
+        </w:rPr>
+        <w:t xml:space="preserve"> (convicted of conspiracy to provide material support to al-Qaeda): "Fahad Hashmi is also a Queens resident… </w:t>
+      </w:r>
+      <w:r>
+        <w:rPr>
+          <w:b/>
+          <w:i/>
+        </w:rPr>
+        <w:t>I won't apologize</w:t>
+      </w:r>
+      <w:r>
+        <w:rPr>
+          <w:i/>
+        </w:rPr>
+        <w:t xml:space="preserve"> for having participated in advocating for a fair trial."</w:t>
+      </w:r>
+    </w:p>
+    <w:p>
+      <w:pPr>
+        <w:pStyle w:val="Heading3"/>
+      </w:pPr>
+      <w:r>
+        <w:t>6. On-camera: calls Israel's actions "genocide" and "occupation"</w:t>
+      </w:r>
+    </w:p>
+    <w:p>
+      <w:hyperlink r:id="rId29">
+        <w:r>
+          <w:rPr>
+            <w:color w:val="1155CC"/>
+            <w:u w:val="single"/>
+          </w:rPr>
+          <w:t xml:space="preserve">Democracy Now, June 30 2026</w:t>
+        </w:r>
+      </w:hyperlink>
+      <w:r>
+        <w:t>: she calls Israel's actions "genocide" and "occupation," and says Democrats should have answered October 7 by calling for "an end to occupation."</w:t>
+      </w:r>
+    </w:p>
+    <w:p>
+      <w:pPr>
+        <w:pStyle w:val="Heading3"/>
+      </w:pPr>
+      <w:r>
+        <w:t>7. Father's deportation narrative vs. the court record</w:t>
+      </w:r>
+    </w:p>
+    <w:p>
+      <w:r>
+        <w:t xml:space="preserve">Her narrative (on camera, </w:t>
+      </w:r>
+      <w:hyperlink r:id="rId29">
+        <w:r>
+          <w:rPr>
+            <w:color w:val="1155CC"/>
+            <w:u w:val="single"/>
+          </w:rPr>
+          <w:t xml:space="preserve">Democracy Now</w:t>
+        </w:r>
+      </w:hyperlink>
+      <w:r>
+        <w:t>): her father was taken by ICE, held ~3 years, and deported to Jordan "the year Obama was elected," which she blames on a "cruel immigration system."</w:t>
+      </w:r>
+    </w:p>
+    <w:p>
+      <w:r>
+        <w:t xml:space="preserve">The record: her father overstayed a 1989 tourist visa, </w:t>
       </w:r>
       <w:r>
         <w:rPr>
@@ -296,28 +767,31 @@
         <w:rPr>
           <w:b/>
         </w:rPr>
-        <w:t>U.S. Court of Appeals for the Third Circuit denied his final petition on December 24, 2008</w:t>
+        <w:t>Third Circuit denied his final petition Dec 24, 2008</w:t>
       </w:r>
       <w:r>
-        <w:t xml:space="preserve"> (*Kawas v. Attorney General*, No. 08-2245, Agency No. A79-130-693). </w:t>
+        <w:t xml:space="preserve"> — </w:t>
+      </w:r>
+      <w:hyperlink r:id="rId30">
+        <w:r>
+          <w:rPr>
+            <w:color w:val="1155CC"/>
+            <w:u w:val="single"/>
+          </w:rPr>
+          <w:t xml:space="preserve">*Kawas v. Attorney General*, No. 08-2245 (official court PDF)</w:t>
+        </w:r>
+      </w:hyperlink>
+      <w:r>
+        <w:t xml:space="preserve">. Reporting from state court records adds a </w:t>
       </w:r>
       <w:r>
         <w:rPr>
           <w:b/>
         </w:rPr>
-        <w:t>[5]</w:t>
+        <w:t>1995 Virginia felony</w:t>
       </w:r>
       <w:r>
-        <w:t xml:space="preserve"> Reporting based on state court records adds a </w:t>
-      </w:r>
-      <w:r>
-        <w:rPr>
-          <w:b/>
-        </w:rPr>
-        <w:t>1995 Virginia felony conviction for making a false statement</w:t>
-      </w:r>
-      <w:r>
-        <w:t xml:space="preserve"> and a </w:t>
+        <w:t xml:space="preserve"> (false statement) and a </w:t>
       </w:r>
       <w:r>
         <w:rPr>
@@ -326,18 +800,19 @@
         <w:t>2006 New Jersey guilty plea to theft by deception</w:t>
       </w:r>
       <w:r>
-        <w:t xml:space="preserve"> (inflated property values), for which he was sentenced to three years. </w:t>
+        <w:t xml:space="preserve">, 3-year sentence: </w:t>
       </w:r>
+      <w:hyperlink r:id="rId31">
+        <w:r>
+          <w:rPr>
+            <w:color w:val="1155CC"/>
+            <w:u w:val="single"/>
+          </w:rPr>
+          <w:t xml:space="preserve">NY Post via AOL</w:t>
+        </w:r>
+      </w:hyperlink>
       <w:r>
-        <w:rPr>
-          <w:b/>
-        </w:rPr>
-        <w:t>[6]</w:t>
-      </w:r>
-    </w:p>
-    <w:p>
-      <w:r>
-        <w:t>→ The deportation followed standard removal proceedings under the Bush administration and a documented criminal record — which her "cruel immigration system" framing omits.</w:t>
+        <w:t>. → Standard removal under the Bush administration plus a criminal record — which her "cruel immigration system" framing omits.</w:t>
       </w:r>
     </w:p>
     <w:p>
@@ -345,350 +820,7 @@
         <w:pStyle w:val="Heading3"/>
       </w:pPr>
       <w:r>
-        <w:t>3. Self-identified anti-Zionist; defends al-Qaeda-support defendant (her own words, live interview)</w:t>
-      </w:r>
-    </w:p>
-    <w:p>
-      <w:r>
-        <w:t xml:space="preserve">City &amp; State New York interview (Nov 24, 2025): </w:t>
-      </w:r>
-      <w:r>
-        <w:rPr>
-          <w:b/>
-        </w:rPr>
-        <w:t>[7]</w:t>
-      </w:r>
-    </w:p>
-    <w:p>
-      <w:pPr>
-        <w:pStyle w:val="ListBullet"/>
-      </w:pPr>
-      <w:r>
-        <w:t>"</w:t>
-      </w:r>
-      <w:r>
-        <w:rPr>
-          <w:b/>
-        </w:rPr>
-        <w:t>I would identify as an anti-Zionist</w:t>
-      </w:r>
-      <w:r>
-        <w:t>… somebody who wants an end to the occupation and apartheid and genocide in Palestine."</w:t>
-      </w:r>
-    </w:p>
-    <w:p>
-      <w:pPr>
-        <w:pStyle w:val="ListBullet"/>
-      </w:pPr>
-      <w:r>
-        <w:t xml:space="preserve">On </w:t>
-      </w:r>
-      <w:r>
-        <w:rPr>
-          <w:b/>
-        </w:rPr>
-        <w:t>Syed Fahad Hashmi</w:t>
-      </w:r>
-      <w:r>
-        <w:t xml:space="preserve"> (convicted of conspiracy to provide material support to al-Qaeda): "Fahad Hashmi is also a Queens resident… </w:t>
-      </w:r>
-      <w:r>
-        <w:rPr>
-          <w:b/>
-        </w:rPr>
-        <w:t>I won't apologize</w:t>
-      </w:r>
-      <w:r>
-        <w:t xml:space="preserve"> for having participated in advocating for a fair trial." </w:t>
-      </w:r>
-      <w:r>
-        <w:rPr>
-          <w:b/>
-        </w:rPr>
-        <w:t>[7]</w:t>
-      </w:r>
-    </w:p>
-    <w:p>
-      <w:pPr>
-        <w:pStyle w:val="Heading3"/>
-      </w:pPr>
-      <w:r>
-        <w:t>4. NYC-DSA rally pledges — divest pensions from Israel, block weapons through Queens (video; timestamps exact)</w:t>
-      </w:r>
-    </w:p>
-    <w:p>
-      <w:r>
-        <w:t xml:space="preserve">NYC-DSA slate rally, introduced by Linda Sarsour. </w:t>
-      </w:r>
-      <w:r>
-        <w:rPr>
-          <w:b/>
-        </w:rPr>
-        <w:t>[9]</w:t>
-      </w:r>
-    </w:p>
-    <w:p>
-      <w:pPr>
-        <w:pStyle w:val="ListBullet"/>
-      </w:pPr>
-      <w:r>
-        <w:rPr>
-          <w:b/>
-        </w:rPr>
-        <w:t>At 10:17</w:t>
-      </w:r>
-      <w:r>
-        <w:t xml:space="preserve"> — "…that is the bill that </w:t>
-      </w:r>
-      <w:r>
-        <w:rPr>
-          <w:b/>
-        </w:rPr>
-        <w:t>I helped write</w:t>
-      </w:r>
-      <w:r>
-        <w:t xml:space="preserve"> with then-Assembly Member Mamdani" (the "Not on Our Dime" bill). </w:t>
-      </w:r>
-      <w:r>
-        <w:rPr>
-          <w:b/>
-        </w:rPr>
-        <w:t>[9]</w:t>
-      </w:r>
-    </w:p>
-    <w:p>
-      <w:pPr>
-        <w:pStyle w:val="ListBullet"/>
-      </w:pPr>
-      <w:r>
-        <w:rPr>
-          <w:b/>
-        </w:rPr>
-        <w:t>At 10:32</w:t>
-      </w:r>
-      <w:r>
-        <w:t xml:space="preserve"> — "We are going to pass Not on Our Dime. We are going to </w:t>
-      </w:r>
-      <w:r>
-        <w:rPr>
-          <w:b/>
-        </w:rPr>
-        <w:t>divest our state pension funds from Israel</w:t>
-      </w:r>
-      <w:r>
-        <w:t xml:space="preserve">." </w:t>
-      </w:r>
-      <w:r>
-        <w:rPr>
-          <w:b/>
-        </w:rPr>
-        <w:t>[9]</w:t>
-      </w:r>
-    </w:p>
-    <w:p>
-      <w:pPr>
-        <w:pStyle w:val="ListBullet"/>
-      </w:pPr>
-      <w:r>
-        <w:rPr>
-          <w:b/>
-        </w:rPr>
-        <w:t>At 10:51</w:t>
-      </w:r>
-      <w:r>
-        <w:t xml:space="preserve"> — "…we are going to </w:t>
-      </w:r>
-      <w:r>
-        <w:rPr>
-          <w:b/>
-        </w:rPr>
-        <w:t>stop the pipeline of weapons being shipped from our airports here in Queens</w:t>
-      </w:r>
-      <w:r>
-        <w:t xml:space="preserve">." </w:t>
-      </w:r>
-      <w:r>
-        <w:rPr>
-          <w:b/>
-        </w:rPr>
-        <w:t>[9]</w:t>
-      </w:r>
-    </w:p>
-    <w:p>
-      <w:pPr>
-        <w:pStyle w:val="ListBullet"/>
-      </w:pPr>
-      <w:r>
-        <w:rPr>
-          <w:b/>
-        </w:rPr>
-        <w:t>At 2:42</w:t>
-      </w:r>
-      <w:r>
-        <w:t xml:space="preserve"> — Sarsour says she has known Kawas "since she was </w:t>
-      </w:r>
-      <w:r>
-        <w:rPr>
-          <w:b/>
-        </w:rPr>
-        <w:t>12 years old</w:t>
-      </w:r>
-      <w:r>
-        <w:t xml:space="preserve">." </w:t>
-      </w:r>
-      <w:r>
-        <w:rPr>
-          <w:b/>
-        </w:rPr>
-        <w:t>[9]</w:t>
-      </w:r>
-    </w:p>
-    <w:p>
-      <w:pPr>
-        <w:pStyle w:val="Heading3"/>
-      </w:pPr>
-      <w:r>
-        <w:t>5. "Not on Our Dime" co-authorship + calls NY charities funders of "atrocities" (video; timestamps exact)</w:t>
-      </w:r>
-    </w:p>
-    <w:p>
-      <w:r>
-        <w:t xml:space="preserve">Sit-down interview. </w:t>
-      </w:r>
-      <w:r>
-        <w:rPr>
-          <w:b/>
-        </w:rPr>
-        <w:t>[10]</w:t>
-      </w:r>
-    </w:p>
-    <w:p>
-      <w:pPr>
-        <w:pStyle w:val="ListBullet"/>
-      </w:pPr>
-      <w:r>
-        <w:rPr>
-          <w:b/>
-        </w:rPr>
-        <w:t>At 8:03</w:t>
-      </w:r>
-      <w:r>
-        <w:t xml:space="preserve"> — "…I'm someone who </w:t>
-      </w:r>
-      <w:r>
-        <w:rPr>
-          <w:b/>
-        </w:rPr>
-        <w:t>helped write the Not on Our Dime</w:t>
-      </w:r>
-      <w:r>
-        <w:t xml:space="preserve"> [bill]…"</w:t>
-      </w:r>
-    </w:p>
-    <w:p>
-      <w:pPr>
-        <w:pStyle w:val="ListBullet"/>
-      </w:pPr>
-      <w:r>
-        <w:rPr>
-          <w:b/>
-        </w:rPr>
-        <w:t>At 8:20–8:24</w:t>
-      </w:r>
-      <w:r>
-        <w:t xml:space="preserve"> — the targeted charities raise money "under charitable status… </w:t>
-      </w:r>
-      <w:r>
-        <w:rPr>
-          <w:b/>
-        </w:rPr>
-        <w:t>to literally fund people to go commit human rights atrocities abroad</w:t>
-      </w:r>
-      <w:r>
-        <w:t xml:space="preserve">." </w:t>
-      </w:r>
-      <w:r>
-        <w:rPr>
-          <w:b/>
-        </w:rPr>
-        <w:t>[10]</w:t>
-      </w:r>
-    </w:p>
-    <w:p>
-      <w:pPr>
-        <w:pStyle w:val="ListBullet"/>
-      </w:pPr>
-      <w:r>
-        <w:t xml:space="preserve">Corroborated by City &amp; State (May 2026): she helped write the bill before running. </w:t>
-      </w:r>
-      <w:r>
-        <w:rPr>
-          <w:b/>
-        </w:rPr>
-        <w:t>[13]</w:t>
-      </w:r>
-    </w:p>
-    <w:p>
-      <w:pPr>
-        <w:pStyle w:val="Heading3"/>
-      </w:pPr>
-      <w:r>
-        <w:t>6. Mahmoud Khalil / ICE-detainee advocacy (her own words, video; timestamp exact)</w:t>
-      </w:r>
-    </w:p>
-    <w:p>
-      <w:r>
-        <w:t xml:space="preserve">Same interview: </w:t>
-      </w:r>
-      <w:r>
-        <w:rPr>
-          <w:b/>
-        </w:rPr>
-        <w:t>at 11:34</w:t>
-      </w:r>
-      <w:r>
-        <w:t xml:space="preserve"> — "You can see behind me I have a </w:t>
-      </w:r>
-      <w:r>
-        <w:rPr>
-          <w:b/>
-        </w:rPr>
-        <w:t>Free Mahmoud Khalil poster</w:t>
-      </w:r>
-      <w:r>
-        <w:t xml:space="preserve">. I was part of a legal organization, </w:t>
-      </w:r>
-      <w:r>
-        <w:rPr>
-          <w:b/>
-        </w:rPr>
-        <w:t>CLEAR</w:t>
-      </w:r>
-      <w:r>
-        <w:t xml:space="preserve">, which was one of his legal representatives…" </w:t>
-      </w:r>
-      <w:r>
-        <w:rPr>
-          <w:b/>
-        </w:rPr>
-        <w:t>[10]</w:t>
-      </w:r>
-      <w:r>
-        <w:t xml:space="preserve"> Her CLEAR role (Associate Director of Partnerships, July 2024–April 2026) is confirmed on the CUNY Law CLEAR staff page. </w:t>
-      </w:r>
-      <w:r>
-        <w:rPr>
-          <w:b/>
-        </w:rPr>
-        <w:t>[11]</w:t>
-      </w:r>
-    </w:p>
-    <w:p>
-      <w:pPr>
-        <w:pStyle w:val="Heading3"/>
-      </w:pPr>
-      <w:r>
-        <w:t>7. BDS pledge / "Zionist lobby groups" — the actual questionnaire (live primary document)</w:t>
+        <w:t>8. BDS pledge / "Zionist lobby groups" — her signed questionnaire (live primary document)</w:t>
       </w:r>
     </w:p>
     <w:p>
@@ -699,35 +831,22 @@
         <w:rPr>
           <w:b/>
         </w:rPr>
-        <w:t>NYC-DSA State Legislative Candidate Questionnaire</w:t>
+        <w:t>NYC-DSA candidate questionnaire</w:t>
       </w:r>
       <w:r>
-        <w:t xml:space="preserve"> (2025), hosted publicly: she identifies as a BDS supporter and pledges to "refrain from any and all affiliation with the Israeli government and Zionist lobby groups." </w:t>
+        <w:t xml:space="preserve">: identifies as a BDS supporter and pledges to "refrain from any and all affiliation with the Israeli government and Zionist lobby groups." — </w:t>
       </w:r>
+      <w:hyperlink r:id="rId32">
+        <w:r>
+          <w:rPr>
+            <w:color w:val="1155CC"/>
+            <w:u w:val="single"/>
+          </w:rPr>
+          <w:t xml:space="preserve">questionnaire PDF</w:t>
+        </w:r>
+      </w:hyperlink>
       <w:r>
-        <w:rPr>
-          <w:b/>
-        </w:rPr>
-        <w:t>[15]</w:t>
-      </w:r>
-    </w:p>
-    <w:p>
-      <w:pPr>
-        <w:pStyle w:val="Heading3"/>
-      </w:pPr>
-      <w:r>
-        <w:t>8. On-camera characterizations of Israel (live video/transcript)</w:t>
-      </w:r>
-    </w:p>
-    <w:p>
-      <w:r>
-        <w:t xml:space="preserve">Democracy Now (June 30, 2026): she calls Israel's actions "genocide" and "occupation," and says Democrats should have answered October 7 by calling for "an end to occupation." </w:t>
-      </w:r>
-      <w:r>
-        <w:rPr>
-          <w:b/>
-        </w:rPr>
-        <w:t>[8]</w:t>
+        <w:t>.</w:t>
       </w:r>
     </w:p>
     <w:p>
@@ -740,13 +859,19 @@
     </w:p>
     <w:p>
       <w:r>
-        <w:t xml:space="preserve">US Campaign for Palestinian Rights (national BDS organization) lists her as a steering-committee member (Aug 2023), on its own site. </w:t>
+        <w:t xml:space="preserve">Listed as a steering-committee member of the US Campaign for Palestinian Rights (Aug 2023), on its </w:t>
       </w:r>
+      <w:hyperlink r:id="rId33">
+        <w:r>
+          <w:rPr>
+            <w:color w:val="1155CC"/>
+            <w:u w:val="single"/>
+          </w:rPr>
+          <w:t xml:space="preserve">own site</w:t>
+        </w:r>
+      </w:hyperlink>
       <w:r>
-        <w:rPr>
-          <w:b/>
-        </w:rPr>
-        <w:t>[12]</w:t>
+        <w:t>.</w:t>
       </w:r>
     </w:p>
     <w:p>
@@ -759,16 +884,19 @@
     </w:p>
     <w:p>
       <w:r>
-        <w:t xml:space="preserve">Her own live Instagram reel, caption "South Africa to Palestine," posted three months after October 7. </w:t>
+        <w:t xml:space="preserve">Her own live </w:t>
       </w:r>
+      <w:hyperlink r:id="rId34">
+        <w:r>
+          <w:rPr>
+            <w:color w:val="1155CC"/>
+            <w:u w:val="single"/>
+          </w:rPr>
+          <w:t xml:space="preserve">Instagram reel</w:t>
+        </w:r>
+      </w:hyperlink>
       <w:r>
-        <w:rPr>
-          <w:b/>
-        </w:rPr>
-        <w:t>[17]</w:t>
-      </w:r>
-      <w:r>
-        <w:t xml:space="preserve"> (The reel is live; a chant sometimes attributed to its audio is not verified here — watch the reel before quoting any chant.)</w:t>
+        <w:t>, caption "South Africa to Palestine," posted ~3 months after October 7. (Reel is live; verify any chant audio before quoting it.)</w:t>
       </w:r>
     </w:p>
     <w:p>
@@ -788,7 +916,7 @@
     </w:p>
     <w:p>
       <w:r>
-        <w:t xml:space="preserve">Her Tumblr ("ZapatistaHijabi", aberkawas.tumblr.com) went offline after Jewish Insider's Nov 2025 story. Because you asked for live sources only, these items are cited to the </w:t>
+        <w:t xml:space="preserve">Her Tumblr went offline after Jewish Insider's Nov 2025 story. Per your live-sources-only rule, these are cited to the </w:t>
       </w:r>
       <w:r>
         <w:rPr>
@@ -797,7 +925,7 @@
         <w:t>news articles</w:t>
       </w:r>
       <w:r>
-        <w:t xml:space="preserve"> that quoted the posts. Both outlets lean pro-Israel/conservative — flagged for transparency; treat as reported, not independently re-confirmed on a live page.</w:t>
+        <w:t xml:space="preserve"> that quoted the posts. Both outlets lean pro-Israel/conservative — flagged; treat as reported, not live-primary.</w:t>
       </w:r>
     </w:p>
     <w:p>
@@ -811,23 +939,29 @@
         <w:t>"Imprisoned heroes / living martyrs"</w:t>
       </w:r>
       <w:r>
-        <w:t xml:space="preserve"> — reportedly called Fahad Hashmi (al-Qaeda material support), the Holy Land Five (Hamas financing), and Tarek Mehanna (al-Qaeda material support) "imprisoned heroes" and "living martyrs." Reported by Jewish Insider </w:t>
+        <w:t xml:space="preserve"> — reportedly called Fahad Hashmi (al-Qaeda material support), the Holy Land Five (Hamas financing), and Tarek Mehanna (al-Qaeda material support) "imprisoned heroes" and "living martyrs." — </w:t>
       </w:r>
+      <w:hyperlink r:id="rId10">
+        <w:r>
+          <w:rPr>
+            <w:color w:val="1155CC"/>
+            <w:u w:val="single"/>
+          </w:rPr>
+          <w:t xml:space="preserve">Jewish Insider</w:t>
+        </w:r>
+      </w:hyperlink>
       <w:r>
-        <w:rPr>
-          <w:b/>
-        </w:rPr>
-        <w:t>[3]</w:t>
+        <w:t xml:space="preserve"> · </w:t>
       </w:r>
-      <w:r>
-        <w:t xml:space="preserve"> and the Washington Free Beacon </w:t>
-      </w:r>
-      <w:r>
-        <w:rPr>
-          <w:b/>
-        </w:rPr>
-        <w:t>[16]</w:t>
-      </w:r>
+      <w:hyperlink r:id="rId35">
+        <w:r>
+          <w:rPr>
+            <w:color w:val="1155CC"/>
+            <w:u w:val="single"/>
+          </w:rPr>
+          <w:t xml:space="preserve">Washington Free Beacon</w:t>
+        </w:r>
+      </w:hyperlink>
       <w:r>
         <w:t>.</w:t>
       </w:r>
@@ -843,7 +977,7 @@
         <w:t>Ahmad Ferhani "my brother"</w:t>
       </w:r>
       <w:r>
-        <w:t xml:space="preserve"> — reportedly called Ferhani "my brother" and framed him as a victim of NYPD entrapment. Ferhani was arrested in 2011 and </w:t>
+        <w:t xml:space="preserve"> — reportedly called Ferhani "my brother" and framed him as an NYPD-entrapment victim. Ferhani was arrested in 2011 and </w:t>
       </w:r>
       <w:r>
         <w:rPr>
@@ -852,16 +986,19 @@
         <w:t>pleaded guilty in 2012</w:t>
       </w:r>
       <w:r>
-        <w:t xml:space="preserve"> to a plot to attack a Manhattan synagogue (10-year sentence). Reported by the Washington Free Beacon </w:t>
+        <w:t xml:space="preserve"> to a plot to attack a Manhattan synagogue (10-year sentence). — </w:t>
       </w:r>
+      <w:hyperlink r:id="rId35">
+        <w:r>
+          <w:rPr>
+            <w:color w:val="1155CC"/>
+            <w:u w:val="single"/>
+          </w:rPr>
+          <w:t xml:space="preserve">Washington Free Beacon</w:t>
+        </w:r>
+      </w:hyperlink>
       <w:r>
-        <w:rPr>
-          <w:b/>
-        </w:rPr>
-        <w:t>[16]</w:t>
-      </w:r>
-      <w:r>
-        <w:t>. *(See separate "Ferhani explainer" for the full fair-context version.)*</w:t>
+        <w:t>. (See the separate "Ferhani explainer" for the fair-context version.)</w:t>
       </w:r>
     </w:p>
     <w:p>
@@ -875,14 +1012,17 @@
         <w:t>2013 Nakba post</w:t>
       </w:r>
       <w:r>
-        <w:t xml:space="preserve"> — reportedly described Israel as a state built by "European Zionists" on "ethnic cleansing, murder, displacement, and occupation." Reported by Jewish Insider </w:t>
+        <w:t xml:space="preserve"> — reportedly described Israel as a state built by "European Zionists" on "ethnic cleansing, murder, displacement, and occupation." — </w:t>
       </w:r>
-      <w:r>
-        <w:rPr>
-          <w:b/>
-        </w:rPr>
-        <w:t>[3]</w:t>
-      </w:r>
+      <w:hyperlink r:id="rId10">
+        <w:r>
+          <w:rPr>
+            <w:color w:val="1155CC"/>
+            <w:u w:val="single"/>
+          </w:rPr>
+          <w:t xml:space="preserve">Jewish Insider</w:t>
+        </w:r>
+      </w:hyperlink>
       <w:r>
         <w:t>.</w:t>
       </w:r>
@@ -899,328 +1039,7 @@
         <w:pStyle w:val="Heading2"/>
       </w:pPr>
       <w:r>
-        <w:t>AFFILIATIONS TIMELINE (live sources)</w:t>
-      </w:r>
-    </w:p>
-    <w:tbl>
-      <w:tblPr>
-        <w:tblStyle w:val="LightGrid-Accent1"/>
-        <w:tblW w:type="auto" w:w="0"/>
-        <w:tblLook w:firstColumn="1" w:firstRow="1" w:lastColumn="0" w:lastRow="0" w:noHBand="0" w:noVBand="1" w:val="04A0"/>
-      </w:tblPr>
-      <w:tblGrid>
-        <w:gridCol w:w="2880"/>
-        <w:gridCol w:w="2880"/>
-        <w:gridCol w:w="2880"/>
-      </w:tblGrid>
-      <w:tr>
-        <w:tc>
-          <w:tcPr>
-            <w:tcW w:type="dxa" w:w="2880"/>
-          </w:tcPr>
-          <w:p>
-            <w:r>
-              <w:rPr>
-                <w:b/>
-              </w:rPr>
-            </w:r>
-            <w:r>
-              <w:rPr>
-                <w:b/>
-              </w:rPr>
-              <w:t>Period</w:t>
-            </w:r>
-          </w:p>
-        </w:tc>
-        <w:tc>
-          <w:tcPr>
-            <w:tcW w:type="dxa" w:w="2880"/>
-          </w:tcPr>
-          <w:p>
-            <w:r>
-              <w:rPr>
-                <w:b/>
-              </w:rPr>
-            </w:r>
-            <w:r>
-              <w:rPr>
-                <w:b/>
-              </w:rPr>
-              <w:t>Role</w:t>
-            </w:r>
-          </w:p>
-        </w:tc>
-        <w:tc>
-          <w:tcPr>
-            <w:tcW w:type="dxa" w:w="2880"/>
-          </w:tcPr>
-          <w:p>
-            <w:r>
-              <w:rPr>
-                <w:b/>
-              </w:rPr>
-            </w:r>
-            <w:r>
-              <w:rPr>
-                <w:b/>
-              </w:rPr>
-              <w:t>Source</w:t>
-            </w:r>
-          </w:p>
-        </w:tc>
-      </w:tr>
-      <w:tr>
-        <w:tc>
-          <w:tcPr>
-            <w:tcW w:type="dxa" w:w="2880"/>
-          </w:tcPr>
-          <w:p>
-            <w:r/>
-            <w:r>
-              <w:t>~2014–16</w:t>
-            </w:r>
-          </w:p>
-        </w:tc>
-        <w:tc>
-          <w:tcPr>
-            <w:tcW w:type="dxa" w:w="2880"/>
-          </w:tcPr>
-          <w:p>
-            <w:r/>
-            <w:r>
-              <w:t xml:space="preserve">Youth Lead Organizer → Advocacy Director, </w:t>
-            </w:r>
-            <w:r>
-              <w:rPr>
-                <w:b/>
-              </w:rPr>
-              <w:t>Arab American Association of NY</w:t>
-            </w:r>
-            <w:r>
-              <w:t xml:space="preserve"> (Linda Sarsour's org)</w:t>
-            </w:r>
-          </w:p>
-        </w:tc>
-        <w:tc>
-          <w:tcPr>
-            <w:tcW w:type="dxa" w:w="2880"/>
-          </w:tcPr>
-          <w:p>
-            <w:r/>
-            <w:r>
-              <w:t>[3][7]</w:t>
-            </w:r>
-          </w:p>
-        </w:tc>
-      </w:tr>
-      <w:tr>
-        <w:tc>
-          <w:tcPr>
-            <w:tcW w:type="dxa" w:w="2880"/>
-          </w:tcPr>
-          <w:p>
-            <w:r/>
-            <w:r>
-              <w:t>~2016–18</w:t>
-            </w:r>
-          </w:p>
-        </w:tc>
-        <w:tc>
-          <w:tcPr>
-            <w:tcW w:type="dxa" w:w="2880"/>
-          </w:tcPr>
-          <w:p>
-            <w:r/>
-            <w:r>
-              <w:t xml:space="preserve">Work with </w:t>
-            </w:r>
-            <w:r>
-              <w:rPr>
-                <w:b/>
-              </w:rPr>
-              <w:t>CAIR-NY</w:t>
-            </w:r>
-            <w:r>
-              <w:t>, Urban Justice Center; Campaign to Take on Hate (NNAAC)</w:t>
-            </w:r>
-          </w:p>
-        </w:tc>
-        <w:tc>
-          <w:tcPr>
-            <w:tcW w:type="dxa" w:w="2880"/>
-          </w:tcPr>
-          <w:p>
-            <w:r/>
-            <w:r>
-              <w:t>[7]</w:t>
-            </w:r>
-          </w:p>
-        </w:tc>
-      </w:tr>
-      <w:tr>
-        <w:tc>
-          <w:tcPr>
-            <w:tcW w:type="dxa" w:w="2880"/>
-          </w:tcPr>
-          <w:p>
-            <w:r/>
-            <w:r>
-              <w:t>Aug 2023</w:t>
-            </w:r>
-          </w:p>
-        </w:tc>
-        <w:tc>
-          <w:tcPr>
-            <w:tcW w:type="dxa" w:w="2880"/>
-          </w:tcPr>
-          <w:p>
-            <w:r/>
-            <w:r>
-              <w:rPr>
-                <w:b/>
-              </w:rPr>
-              <w:t>USCPR steering committee</w:t>
-            </w:r>
-          </w:p>
-        </w:tc>
-        <w:tc>
-          <w:tcPr>
-            <w:tcW w:type="dxa" w:w="2880"/>
-          </w:tcPr>
-          <w:p>
-            <w:r/>
-            <w:r>
-              <w:t>[12]</w:t>
-            </w:r>
-          </w:p>
-        </w:tc>
-      </w:tr>
-      <w:tr>
-        <w:tc>
-          <w:tcPr>
-            <w:tcW w:type="dxa" w:w="2880"/>
-          </w:tcPr>
-          <w:p>
-            <w:r/>
-            <w:r>
-              <w:t>Jul 2024–Apr 2026</w:t>
-            </w:r>
-          </w:p>
-        </w:tc>
-        <w:tc>
-          <w:tcPr>
-            <w:tcW w:type="dxa" w:w="2880"/>
-          </w:tcPr>
-          <w:p>
-            <w:r/>
-            <w:r>
-              <w:rPr>
-                <w:b/>
-              </w:rPr>
-              <w:t>Associate Director of Partnerships, CLEAR (CUNY Law)</w:t>
-            </w:r>
-          </w:p>
-        </w:tc>
-        <w:tc>
-          <w:tcPr>
-            <w:tcW w:type="dxa" w:w="2880"/>
-          </w:tcPr>
-          <w:p>
-            <w:r/>
-            <w:r>
-              <w:t>[11]</w:t>
-            </w:r>
-          </w:p>
-        </w:tc>
-      </w:tr>
-      <w:tr>
-        <w:tc>
-          <w:tcPr>
-            <w:tcW w:type="dxa" w:w="2880"/>
-          </w:tcPr>
-          <w:p>
-            <w:r/>
-            <w:r>
-              <w:t>Nov 2025</w:t>
-            </w:r>
-          </w:p>
-        </w:tc>
-        <w:tc>
-          <w:tcPr>
-            <w:tcW w:type="dxa" w:w="2880"/>
-          </w:tcPr>
-          <w:p>
-            <w:r/>
-            <w:r>
-              <w:t>Filed for office; Mamdani endorsement</w:t>
-            </w:r>
-          </w:p>
-        </w:tc>
-        <w:tc>
-          <w:tcPr>
-            <w:tcW w:type="dxa" w:w="2880"/>
-          </w:tcPr>
-          <w:p>
-            <w:r/>
-            <w:r>
-              <w:t>[3]</w:t>
-            </w:r>
-          </w:p>
-        </w:tc>
-      </w:tr>
-      <w:tr>
-        <w:tc>
-          <w:tcPr>
-            <w:tcW w:type="dxa" w:w="2880"/>
-          </w:tcPr>
-          <w:p>
-            <w:r/>
-            <w:r>
-              <w:t>Jun 23, 2026</w:t>
-            </w:r>
-          </w:p>
-        </w:tc>
-        <w:tc>
-          <w:tcPr>
-            <w:tcW w:type="dxa" w:w="2880"/>
-          </w:tcPr>
-          <w:p>
-            <w:r/>
-            <w:r>
-              <w:rPr>
-                <w:b/>
-              </w:rPr>
-              <w:t>Won Dem primary, NY Senate SD-12</w:t>
-            </w:r>
-          </w:p>
-        </w:tc>
-        <w:tc>
-          <w:tcPr>
-            <w:tcW w:type="dxa" w:w="2880"/>
-          </w:tcPr>
-          <w:p>
-            <w:r/>
-            <w:r>
-              <w:t>[14]</w:t>
-            </w:r>
-          </w:p>
-        </w:tc>
-      </w:tr>
-    </w:tbl>
-    <w:p/>
-    <w:p>
-      <w:pPr>
-        <w:pBdr>
-          <w:bottom w:val="single" w:sz="6" w:space="1" w:color="999999"/>
-        </w:pBdr>
-      </w:pPr>
-    </w:p>
-    <w:p>
-      <w:pPr>
-        <w:pStyle w:val="Heading2"/>
-      </w:pPr>
-      <w:r>
-        <w:t>EXCLUDED — do NOT use as framed (failed the live/neutral-source bar)</w:t>
+        <w:t>EXCLUDED — do NOT use as framed</w:t>
       </w:r>
     </w:p>
     <w:p>
@@ -1234,7 +1053,7 @@
         <w:t>"Hamas headband" photo</w:t>
       </w:r>
       <w:r>
-        <w:t xml:space="preserve"> — asserted by partisan accounts and outlets; no neutral outlet verified the photo's provenance, and Kawas says it is a decade-old image of a scarf bearing religious text. Unverified.</w:t>
+        <w:t xml:space="preserve"> — no neutral outlet verified the photo's provenance; Kawas says it's a decade-old image of a scarf with religious text. Unverified.</w:t>
       </w:r>
     </w:p>
     <w:p>
@@ -1254,10 +1073,10 @@
         <w:rPr>
           <w:b/>
         </w:rPr>
-        <w:t>misattributed.</w:t>
+        <w:t>misattributed</w:t>
       </w:r>
       <w:r>
-        <w:t xml:space="preserve"> It is a DSA Instagram post, not written or shared by Kawas. Do not use.</w:t>
+        <w:t>; it is a DSA Instagram post, not hers. Do not use.</w:t>
       </w:r>
     </w:p>
     <w:p>
@@ -1268,19 +1087,34 @@
         <w:rPr>
           <w:b/>
         </w:rPr>
-        <w:t>2016 Al-Quds Day chant video</w:t>
+        <w:t>2016 Al-Quds chant video</w:t>
       </w:r>
       <w:r>
-        <w:t xml:space="preserve"> — video is live </w:t>
+        <w:t xml:space="preserve"> — </w:t>
       </w:r>
+      <w:hyperlink r:id="rId36">
+        <w:r>
+          <w:rPr>
+            <w:color w:val="1155CC"/>
+            <w:u w:val="single"/>
+          </w:rPr>
+          <w:t xml:space="preserve">video is live</w:t>
+        </w:r>
+      </w:hyperlink>
       <w:r>
-        <w:rPr>
-          <w:b/>
-        </w:rPr>
-        <w:t>[18]</w:t>
+        <w:t xml:space="preserve"> (chant "When Palestine is under attack… stand up, fight back" at ▶ </w:t>
       </w:r>
+      <w:hyperlink r:id="rId36">
+        <w:r>
+          <w:rPr>
+            <w:color w:val="1155CC"/>
+            <w:u w:val="single"/>
+          </w:rPr>
+          <w:t xml:space="preserve">0:08</w:t>
+        </w:r>
+      </w:hyperlink>
       <w:r>
-        <w:t xml:space="preserve"> (chant "When Palestine is under attack… stand up, fight back" at 0:08–0:39), but her identification as a chant leader is only asserted by a partisan database and is not independently confirmed. Do not attribute to her without a positive visual ID.</w:t>
+        <w:t>), but her identification as a chant leader is only a partisan-database assertion — do not attribute to her without a positive visual ID.</w:t>
       </w:r>
     </w:p>
     <w:p>
@@ -1305,345 +1139,8 @@
       </w:pPr>
     </w:p>
     <w:p>
-      <w:pPr>
-        <w:pStyle w:val="Heading2"/>
-      </w:pPr>
       <w:r>
-        <w:t>SOURCES (all live as of 2026-07-11)</w:t>
-      </w:r>
-    </w:p>
-    <w:p>
-      <w:pPr>
-        <w:pStyle w:val="ListNumber"/>
-      </w:pPr>
-      <w:r>
-        <w:t xml:space="preserve">YouTube — "Islamophobia Beyond 9/11 with Aber Kawas" (Asian American Writers' Workshop): </w:t>
-      </w:r>
-      <w:hyperlink r:id="rId9">
-        <w:r>
-          <w:rPr>
-            <w:color w:val="1155CC"/>
-            <w:u w:val="single"/>
-          </w:rPr>
-          <w:t xml:space="preserve">https://www.youtube.com/watch?v=URdAAEwyI_Q</w:t>
-        </w:r>
-      </w:hyperlink>
-    </w:p>
-    <w:p>
-      <w:pPr>
-        <w:pStyle w:val="ListNumber"/>
-      </w:pPr>
-      <w:r>
-        <w:t xml:space="preserve">Fox News (Peter D'Abrosca, June 26, 2026): </w:t>
-      </w:r>
-      <w:hyperlink r:id="rId10">
-        <w:r>
-          <w:rPr>
-            <w:color w:val="1155CC"/>
-            <w:u w:val="single"/>
-          </w:rPr>
-          <w:t xml:space="preserve">https://www.foxnews.com/politics/muslim-mamdani-backed-socialist-primary-winner-suggested-america-deserved-911-unearthed-video</w:t>
-        </w:r>
-      </w:hyperlink>
-    </w:p>
-    <w:p>
-      <w:pPr>
-        <w:pStyle w:val="ListNumber"/>
-      </w:pPr>
-      <w:r>
-        <w:t xml:space="preserve">Jewish Insider (Nov 20, 2025): </w:t>
-      </w:r>
-      <w:hyperlink r:id="rId11">
-        <w:r>
-          <w:rPr>
-            <w:color w:val="1155CC"/>
-            <w:u w:val="single"/>
-          </w:rPr>
-          <w:t xml:space="preserve">https://jewishinsider.com/2025/11/zohran-mamdani-aber-kawas-palestinian-american-legislative-candidate/</w:t>
-        </w:r>
-      </w:hyperlink>
-    </w:p>
-    <w:p>
-      <w:pPr>
-        <w:pStyle w:val="ListNumber"/>
-      </w:pPr>
-      <w:r>
-        <w:t xml:space="preserve">Mediaite (June 24, 2026): </w:t>
-      </w:r>
-      <w:hyperlink r:id="rId12">
-        <w:r>
-          <w:rPr>
-            <w:color w:val="1155CC"/>
-            <w:u w:val="single"/>
-          </w:rPr>
-          <w:t xml:space="preserve">https://www.mediaite.com/media/news/mamdani-backed-candidate-who-said-us-brought-9-11-on-itself-wins-state-senate-seat/</w:t>
-        </w:r>
-      </w:hyperlink>
-    </w:p>
-    <w:p>
-      <w:pPr>
-        <w:pStyle w:val="ListNumber"/>
-      </w:pPr>
-      <w:r>
-        <w:t xml:space="preserve">U.S. Court of Appeals, 3rd Circuit — *Kawas v. Attorney General*, No. 08-2245 (Dec. 24, 2008): </w:t>
-      </w:r>
-      <w:hyperlink r:id="rId13">
-        <w:r>
-          <w:rPr>
-            <w:color w:val="1155CC"/>
-            <w:u w:val="single"/>
-          </w:rPr>
-          <w:t xml:space="preserve">https://www2.ca3.uscourts.gov/opinarch/082245np.pdf</w:t>
-        </w:r>
-      </w:hyperlink>
-    </w:p>
-    <w:p>
-      <w:pPr>
-        <w:pStyle w:val="ListNumber"/>
-      </w:pPr>
-      <w:r>
-        <w:t xml:space="preserve">NY Post via AOL (father's record): </w:t>
-      </w:r>
-      <w:hyperlink r:id="rId14">
-        <w:r>
-          <w:rPr>
-            <w:color w:val="1155CC"/>
-            <w:u w:val="single"/>
-          </w:rPr>
-          <w:t xml:space="preserve">https://www.aol.com/articles/father-newly-elected-aber-kawas-202738012.html</w:t>
-        </w:r>
-      </w:hyperlink>
-    </w:p>
-    <w:p>
-      <w:pPr>
-        <w:pStyle w:val="ListNumber"/>
-      </w:pPr>
-      <w:r>
-        <w:t xml:space="preserve">City &amp; State New York (Nov 24, 2025): </w:t>
-      </w:r>
-      <w:hyperlink r:id="rId15">
-        <w:r>
-          <w:rPr>
-            <w:color w:val="1155CC"/>
-            <w:u w:val="single"/>
-          </w:rPr>
-          <w:t xml:space="preserve">https://www.cityandstateny.com/personality/2025/11/aber-kawas-not-concerned-about-splitting-progressive-vote/409738/</w:t>
-        </w:r>
-      </w:hyperlink>
-    </w:p>
-    <w:p>
-      <w:pPr>
-        <w:pStyle w:val="ListNumber"/>
-      </w:pPr>
-      <w:r>
-        <w:t xml:space="preserve">Democracy Now (June 30, 2026): </w:t>
-      </w:r>
-      <w:hyperlink r:id="rId16">
-        <w:r>
-          <w:rPr>
-            <w:color w:val="1155CC"/>
-            <w:u w:val="single"/>
-          </w:rPr>
-          <w:t xml:space="preserve">https://www.democracynow.org/2026/6/30/aber_kawas</w:t>
-        </w:r>
-      </w:hyperlink>
-    </w:p>
-    <w:p>
-      <w:pPr>
-        <w:pStyle w:val="ListNumber"/>
-      </w:pPr>
-      <w:r>
-        <w:t xml:space="preserve">YouTube — NYC-DSA slate rally (Linda Sarsour introduces Kawas): </w:t>
-      </w:r>
-      <w:hyperlink r:id="rId17">
-        <w:r>
-          <w:rPr>
-            <w:color w:val="1155CC"/>
-            <w:u w:val="single"/>
-          </w:rPr>
-          <w:t xml:space="preserve">https://www.youtube.com/watch?v=xKjV3QIJA1w</w:t>
-        </w:r>
-      </w:hyperlink>
-    </w:p>
-    <w:p>
-      <w:pPr>
-        <w:pStyle w:val="ListNumber"/>
-      </w:pPr>
-      <w:r>
-        <w:t xml:space="preserve">YouTube — interview (Not on Our Dime / Mahmoud Khalil): </w:t>
-      </w:r>
-      <w:hyperlink r:id="rId18">
-        <w:r>
-          <w:rPr>
-            <w:color w:val="1155CC"/>
-            <w:u w:val="single"/>
-          </w:rPr>
-          <w:t xml:space="preserve">https://www.youtube.com/watch?v=nhacDr9AjNc</w:t>
-        </w:r>
-      </w:hyperlink>
-    </w:p>
-    <w:p>
-      <w:pPr>
-        <w:pStyle w:val="ListNumber"/>
-      </w:pPr>
-      <w:r>
-        <w:t xml:space="preserve">CUNY Law — CLEAR staff bio: </w:t>
-      </w:r>
-      <w:hyperlink r:id="rId19">
-        <w:r>
-          <w:rPr>
-            <w:color w:val="1155CC"/>
-            <w:u w:val="single"/>
-          </w:rPr>
-          <w:t xml:space="preserve">https://www.cunyclear.org/aber</w:t>
-        </w:r>
-      </w:hyperlink>
-    </w:p>
-    <w:p>
-      <w:pPr>
-        <w:pStyle w:val="ListNumber"/>
-      </w:pPr>
-      <w:r>
-        <w:t xml:space="preserve">US Campaign for Palestinian Rights: </w:t>
-      </w:r>
-      <w:hyperlink r:id="rId20">
-        <w:r>
-          <w:rPr>
-            <w:color w:val="1155CC"/>
-            <w:u w:val="single"/>
-          </w:rPr>
-          <w:t xml:space="preserve">https://uscpr.org/uscpr-national-conference-highlight-not-on-our-dime-session/</w:t>
-        </w:r>
-      </w:hyperlink>
-    </w:p>
-    <w:p>
-      <w:pPr>
-        <w:pStyle w:val="ListNumber"/>
-      </w:pPr>
-      <w:r>
-        <w:t xml:space="preserve">City &amp; State New York (May 2026): </w:t>
-      </w:r>
-      <w:hyperlink r:id="rId21">
-        <w:r>
-          <w:rPr>
-            <w:color w:val="1155CC"/>
-            <w:u w:val="single"/>
-          </w:rPr>
-          <w:t xml:space="preserve">https://www.cityandstateny.com/politics/2026/05/raga-cosponsors-pro-palestine-bill-his-senate-opponent-helped-write/413743/</w:t>
-        </w:r>
-      </w:hyperlink>
-    </w:p>
-    <w:p>
-      <w:pPr>
-        <w:pStyle w:val="ListNumber"/>
-      </w:pPr>
-      <w:r>
-        <w:t xml:space="preserve">QNS — Queens primary results (June 2026): </w:t>
-      </w:r>
-      <w:hyperlink r:id="rId22">
-        <w:r>
-          <w:rPr>
-            <w:color w:val="1155CC"/>
-            <w:u w:val="single"/>
-          </w:rPr>
-          <w:t xml:space="preserve">https://qns.com/2026/06/state-senate-primary-winners/</w:t>
-        </w:r>
-      </w:hyperlink>
-    </w:p>
-    <w:p>
-      <w:pPr>
-        <w:pStyle w:val="ListNumber"/>
-      </w:pPr>
-      <w:r>
-        <w:t xml:space="preserve">NYC-DSA State Legislative Candidate Questionnaire — Aber Kawas (signed, 2025): </w:t>
-      </w:r>
-      <w:hyperlink r:id="rId23">
-        <w:r>
-          <w:rPr>
-            <w:color w:val="1155CC"/>
-            <w:u w:val="single"/>
-          </w:rPr>
-          <w:t xml:space="preserve">https://image.jewishinsider.com/wp-content/uploads/2025/11/20015748/Aber-Kawas-State-Legislative-Candidate-Questionnaire1-1.pdf</w:t>
-        </w:r>
-      </w:hyperlink>
-    </w:p>
-    <w:p>
-      <w:pPr>
-        <w:pStyle w:val="ListNumber"/>
-      </w:pPr>
-      <w:r>
-        <w:t xml:space="preserve">Washington Free Beacon (Ferhani + "imprisoned heroes"): </w:t>
-      </w:r>
-      <w:hyperlink r:id="rId24">
-        <w:r>
-          <w:rPr>
-            <w:color w:val="1155CC"/>
-            <w:u w:val="single"/>
-          </w:rPr>
-          <w:t xml:space="preserve">https://freebeacon.com/latest-news/socialists-unite-mamdani-throws-support-behind-behind-state-assembly-candidate-who-blamed-9-11-on-america/</w:t>
-        </w:r>
-      </w:hyperlink>
-    </w:p>
-    <w:p>
-      <w:pPr>
-        <w:pStyle w:val="ListNumber"/>
-      </w:pPr>
-      <w:r>
-        <w:t xml:space="preserve">Instagram — @aberkawas reel "South Africa to Palestine" (Jan 13, 2024): </w:t>
-      </w:r>
-      <w:hyperlink r:id="rId25">
-        <w:r>
-          <w:rPr>
-            <w:color w:val="1155CC"/>
-            <w:u w:val="single"/>
-          </w:rPr>
-          <w:t xml:space="preserve">https://www.instagram.com/aberkawas/reel/C2CwPR9oKON/</w:t>
-        </w:r>
-      </w:hyperlink>
-    </w:p>
-    <w:p>
-      <w:pPr>
-        <w:pStyle w:val="ListNumber"/>
-      </w:pPr>
-      <w:r>
-        <w:t xml:space="preserve">YouTube — "Al-Quds Day 2016, New York City": </w:t>
-      </w:r>
-      <w:hyperlink r:id="rId26">
-        <w:r>
-          <w:rPr>
-            <w:color w:val="1155CC"/>
-            <w:u w:val="single"/>
-          </w:rPr>
-          <w:t xml:space="preserve">https://www.youtube.com/watch?v=t12mU5MqE6w</w:t>
-        </w:r>
-      </w:hyperlink>
-    </w:p>
-    <w:p>
-      <w:pPr>
-        <w:pStyle w:val="ListNumber"/>
-      </w:pPr>
-      <w:r>
-        <w:t xml:space="preserve">Aber Kawas campaign site: </w:t>
-      </w:r>
-      <w:hyperlink r:id="rId27">
-        <w:r>
-          <w:rPr>
-            <w:color w:val="1155CC"/>
-            <w:u w:val="single"/>
-          </w:rPr>
-          <w:t xml:space="preserve">https://aberforsenate.com/</w:t>
-        </w:r>
-      </w:hyperlink>
-    </w:p>
-    <w:p>
-      <w:r>
-        <w:rPr>
-          <w:b/>
-        </w:rPr>
-        <w:t>Sourcing notes:</w:t>
-      </w:r>
-      <w:r>
-        <w:t xml:space="preserve"> Items 1, 9, 10, 18 are live videos with timestamps you can check directly. Items 5 and 15 are live primary documents (a federal court opinion and her signed questionnaire). Items 3 and 16 (Jewish Insider, Free Beacon) are the only sources for the deleted-blog quotes and lean pro-Israel/conservative — the original blog is offline, so these are "reported," not live-primary. NY Post's own site blocks automated access; item 6 is the live AOL syndication of the same reporting.</w:t>
+        <w:t>*Video timestamps were read directly from each video's captions and link to the exact second. "Reported from her deleted blog" items depend on partisan outlets because the original page is offline; everything else is a live mainstream article, live video, or live official document.*</w:t>
       </w:r>
     </w:p>
     <w:sectPr>

</xml_diff>